<commit_message>
fix(documents): CRDES-47122: Incorrect formatting of list numbering in the document
</commit_message>
<xml_diff>
--- a/template/agreement/terms_and_conditions_turron_document.docx
+++ b/template/agreement/terms_and_conditions_turron_document.docx
@@ -7518,9 +7518,6 @@
         <w:tc>
           <w:tcPr>
             <w:tcW w:w="285" w:type="dxa"/>
-            <w:tcBorders>
-              <w:right w:val="single" w:sz="4" w:space="0" w:color="auto"/>
-            </w:tcBorders>
             <w:tcMar>
               <w:left w:w="0" w:type="dxa"/>
               <w:right w:w="28" w:type="dxa"/>
@@ -7547,9 +7544,6 @@
         <w:tc>
           <w:tcPr>
             <w:tcW w:w="8782" w:type="dxa"/>
-            <w:tcBorders>
-              <w:left w:val="single" w:sz="4" w:space="0" w:color="auto"/>
-            </w:tcBorders>
             <w:tcMar>
               <w:left w:w="85" w:type="dxa"/>
               <w:right w:w="85" w:type="dxa"/>
@@ -26720,12 +26714,6 @@
           <w:rFonts w:ascii="Arial" w:hAnsi="Arial" w:cs="Arial"/>
           <w:lang w:val="es-ES"/>
         </w:rPr>
-      </w:r>
-      <w:r>
-        <w:rPr>
-          <w:rFonts w:ascii="Arial" w:hAnsi="Arial" w:cs="Arial"/>
-          <w:lang w:val="es-ES"/>
-        </w:rPr>
         <w:fldChar w:fldCharType="separate"/>
       </w:r>
       <w:r>
@@ -26734,23 +26722,7 @@
           <w:rFonts w:ascii="Arial" w:hAnsi="Arial" w:cs="Arial"/>
           <w:lang w:val="es-ES"/>
         </w:rPr>
-        <w:t>https://ec.europa.eu/consumers/odr/main/index.cf</w:t>
-      </w:r>
-      <w:r>
-        <w:rPr>
-          <w:rStyle w:val="a3"/>
-          <w:rFonts w:ascii="Arial" w:hAnsi="Arial" w:cs="Arial"/>
-          <w:lang w:val="es-ES"/>
-        </w:rPr>
-        <w:t>m</w:t>
-      </w:r>
-      <w:r>
-        <w:rPr>
-          <w:rStyle w:val="a3"/>
-          <w:rFonts w:ascii="Arial" w:hAnsi="Arial" w:cs="Arial"/>
-          <w:lang w:val="es-ES"/>
-        </w:rPr>
-        <w:t>?event=main.home2.show&amp;lng</w:t>
+        <w:t>https://ec.europa.eu/consumers/odr/main/index.cfm?event=main.home2.show&amp;lng</w:t>
       </w:r>
     </w:p>
     <w:p>

</xml_diff>